<commit_message>
Story-led executive summary and corrected agriculture claims
Executive summary now opens with the UK NBSAP signal, regulatory
drivers and LBG exposure. Removes the incorrect statement that
agriculture is LBG's largest nature-related exposure.

Co-Authored-By: Claude Opus 5.5 <noreply@anthropic.com>
Claude-Session: https://claude.ai/code/session_01JceH5MqRn93y3Fzok3yEHi
</commit_message>
<xml_diff>
--- a/copilot-nature-agent/Nature_Opportunity_Assessment_Methodology.docx
+++ b/copilot-nature-agent/Nature_Opportunity_Assessment_Methodology.docx
@@ -1601,7 +1601,7 @@
                 <w:sz w:val="21"/>
                 <w:szCs w:val="21"/>
               </w:rPr>
-              <w:t xml:space="preserve"> is LBG’s largest nature-related lending exposure.</w:t>
+              <w:t xml:space="preserve"> (£6.8bn exposure) just misses High.</w:t>
             </w:r>
           </w:p>
         </w:tc>
@@ -7904,7 +7904,7 @@
                 <w:sz w:val="19"/>
                 <w:szCs w:val="19"/>
               </w:rPr>
-              <w:t xml:space="preserve">Largest nature exposure (£6.7bn), but fewer UK commitments</w:t>
+              <w:t xml:space="preserve">£6.8bn agriculture, forestry and fishing exposure, but only two UK commitments</w:t>
             </w:r>
           </w:p>
         </w:tc>

</xml_diff>

<commit_message>
Update toolkit to new story and split-slide layouts; archive old decks
Deck skeleton pages 2-3 rebuilt (story-led executive summary,
priority chart vs exposure tiles). Master template gains new
Slide_Content keys, automatic national stats, short names and a
Deck_Chart tab. Guides and methodology document updated. Earlier
LBG decks moved to archive.

Co-Authored-By: Claude Opus 5.5 <noreply@anthropic.com>
Claude-Session: https://claude.ai/code/session_01JceH5MqRn93y3Fzok3yEHi
</commit_message>
<xml_diff>
--- a/copilot-nature-agent/Nature_Opportunity_Assessment_Methodology.docx
+++ b/copilot-nature-agent/Nature_Opportunity_Assessment_Methodology.docx
@@ -5849,7 +5849,7 @@
                 <w:sz w:val="19"/>
                 <w:szCs w:val="19"/>
               </w:rPr>
-              <w:t xml:space="preserve">Three headline figures, key findings (exposure, action, gap), top priorities and what it means for the client.</w:t>
+              <w:t xml:space="preserve">A short story in three cards: the national signal (what the country is investing in nature), the rules (regulation and market drivers) and why the client is exposed. Then the top four priorities and a one-line “so what”.</w:t>
             </w:r>
           </w:p>
         </w:tc>
@@ -5887,7 +5887,7 @@
                 <w:sz w:val="19"/>
                 <w:szCs w:val="19"/>
               </w:rPr>
-              <w:t xml:space="preserve">2. Priorities</w:t>
+              <w:t xml:space="preserve">2. Priority vs exposure</w:t>
             </w:r>
           </w:p>
         </w:tc>
@@ -5920,7 +5920,7 @@
                 <w:sz w:val="19"/>
                 <w:szCs w:val="19"/>
               </w:rPr>
-              <w:t xml:space="preserve">A ranked table of the High and Medium topics, with national commitments, client exposure, score and key evidence. Low topics are listed underneath.</w:t>
+              <w:t xml:space="preserve">Left: a bar chart of the High and Medium priorities. Right: tiles showing where the client’s exposure sits, each linked to the priorities it touches. Ends with a one-line “so what”.</w:t>
             </w:r>
           </w:p>
         </w:tc>

</xml_diff>